<commit_message>
Migrate Fiona workspace paths and documentation
</commit_message>
<xml_diff>
--- a/docs/export/Architecture.docx
+++ b/docs/export/Architecture.docx
@@ -31,7 +31,6 @@
     <w:tbl>
       <w:tblPr>
         <w:tblW w:type="auto" w:w="0"/>
-        <w:tblLayout w:type="autofit"/>
         <w:tblLook w:firstColumn="1" w:firstRow="1" w:lastColumn="0" w:lastRow="0" w:noHBand="0" w:noVBand="1" w:val="04A0"/>
       </w:tblPr>
       <w:tblGrid>
@@ -135,7 +134,7 @@
           </w:tcPr>
           <w:p>
             <w:r>
-              <w:t>V1.0.0</w:t>
+              <w:t>V1.0.1</w:t>
             </w:r>
           </w:p>
         </w:tc>
@@ -1089,7 +1088,7 @@
           <w:color w:val="374151"/>
           <w:sz w:val="18"/>
         </w:rPr>
-        <w:t xml:space="preserve">    GitHub --&gt; Railway</w:t>
+        <w:t>GitHub --&gt; Railway</w:t>
       </w:r>
     </w:p>
     <w:p>
@@ -1103,7 +1102,67 @@
           <w:color w:val="374151"/>
           <w:sz w:val="18"/>
         </w:rPr>
-        <w:t xml:space="preserve">    Railway --&gt; Telegram</w:t>
+        <w:t>Railway --&gt; Telegram</w:t>
+      </w:r>
+    </w:p>
+    <w:p>
+      <w:pPr>
+        <w:pStyle w:val="Heading2"/>
+      </w:pPr>
+      <w:r>
+        <w:t>1.1 本地 Workspace</w:t>
+      </w:r>
+    </w:p>
+    <w:p>
+      <w:r>
+        <w:t>Fiona 本地开发仓库位置：</w:t>
+      </w:r>
+    </w:p>
+    <w:p>
+      <w:pPr>
+        <w:spacing w:after="40"/>
+        <w:ind w:left="288"/>
+      </w:pPr>
+      <w:r>
+        <w:rPr>
+          <w:rFonts w:ascii="Courier New" w:hAnsi="Courier New"/>
+          <w:color w:val="374151"/>
+          <w:sz w:val="18"/>
+        </w:rPr>
+        <w:t>~/Documents/Wilson AI Lab/Fiona Intelligence Platform/03_Development/fiona-intelligence-system/</w:t>
+      </w:r>
+    </w:p>
+    <w:p>
+      <w:r>
+        <w:t>本地数据、历史 reports 和旧 runtime 归档位置：</w:t>
+      </w:r>
+    </w:p>
+    <w:p>
+      <w:pPr>
+        <w:spacing w:after="40"/>
+        <w:ind w:left="288"/>
+      </w:pPr>
+      <w:r>
+        <w:rPr>
+          <w:rFonts w:ascii="Courier New" w:hAnsi="Courier New"/>
+          <w:color w:val="374151"/>
+          <w:sz w:val="18"/>
+        </w:rPr>
+        <w:t>~/Documents/Wilson AI Lab/Fiona Intelligence Platform/04_Data/</w:t>
+      </w:r>
+    </w:p>
+    <w:p>
+      <w:pPr>
+        <w:spacing w:after="40"/>
+        <w:ind w:left="288"/>
+      </w:pPr>
+      <w:r>
+        <w:rPr>
+          <w:rFonts w:ascii="Courier New" w:hAnsi="Courier New"/>
+          <w:color w:val="374151"/>
+          <w:sz w:val="18"/>
+        </w:rPr>
+        <w:t>~/Documents/Wilson AI Lab/Fiona Intelligence Platform/Archive/</w:t>
       </w:r>
     </w:p>
     <w:p>

</xml_diff>